<commit_message>
Versão 1.7 - Simplificação no Pagamento a Vista e Adição de Mascaras
</commit_message>
<xml_diff>
--- a/template_contrato.docx
+++ b/template_contrato.docx
@@ -234,16 +234,7 @@
                 <w:sz w:val="18"/>
                 <w:szCs w:val="18"/>
               </w:rPr>
-              <w:t xml:space="preserve"> </w:t>
-            </w:r>
-            <w:proofErr w:type="gramStart"/>
-            <w:r>
-              <w:rPr>
-                <w:rFonts w:cs="Arial"/>
-                <w:sz w:val="18"/>
-                <w:szCs w:val="18"/>
-              </w:rPr>
-              <w:t xml:space="preserve">{{ </w:t>
+              <w:t xml:space="preserve"> {{ </w:t>
             </w:r>
             <w:proofErr w:type="spellStart"/>
             <w:r>
@@ -252,16 +243,7 @@
                 <w:sz w:val="18"/>
                 <w:szCs w:val="18"/>
               </w:rPr>
-              <w:t>nome</w:t>
-            </w:r>
-            <w:proofErr w:type="gramEnd"/>
-            <w:r>
-              <w:rPr>
-                <w:rFonts w:cs="Arial"/>
-                <w:sz w:val="18"/>
-                <w:szCs w:val="18"/>
-              </w:rPr>
-              <w:t>_contratante</w:t>
+              <w:t>nome_contratante</w:t>
             </w:r>
             <w:proofErr w:type="spellEnd"/>
             <w:r>
@@ -320,7 +302,6 @@
               </w:rPr>
               <w:t xml:space="preserve">: </w:t>
             </w:r>
-            <w:proofErr w:type="gramStart"/>
             <w:r>
               <w:rPr>
                 <w:rFonts w:cs="Arial"/>
@@ -336,16 +317,7 @@
                 <w:sz w:val="18"/>
                 <w:szCs w:val="18"/>
               </w:rPr>
-              <w:t>nome</w:t>
-            </w:r>
-            <w:proofErr w:type="gramEnd"/>
-            <w:r>
-              <w:rPr>
-                <w:rFonts w:cs="Arial"/>
-                <w:sz w:val="18"/>
-                <w:szCs w:val="18"/>
-              </w:rPr>
-              <w:t>_aluno</w:t>
+              <w:t>nome_aluno</w:t>
             </w:r>
             <w:proofErr w:type="spellEnd"/>
             <w:r>
@@ -391,7 +363,6 @@
               </w:rPr>
               <w:t xml:space="preserve">CPF: </w:t>
             </w:r>
-            <w:proofErr w:type="gramStart"/>
             <w:r>
               <w:rPr>
                 <w:rFonts w:cs="Arial"/>
@@ -407,16 +378,7 @@
                 <w:sz w:val="18"/>
                 <w:szCs w:val="18"/>
               </w:rPr>
-              <w:t>cpf</w:t>
-            </w:r>
-            <w:proofErr w:type="gramEnd"/>
-            <w:r>
-              <w:rPr>
-                <w:rFonts w:cs="Arial"/>
-                <w:sz w:val="18"/>
-                <w:szCs w:val="18"/>
-              </w:rPr>
-              <w:t>_contratante</w:t>
+              <w:t>cpf_contratante</w:t>
             </w:r>
             <w:proofErr w:type="spellEnd"/>
             <w:r>
@@ -475,7 +437,6 @@
               </w:rPr>
               <w:t xml:space="preserve">: </w:t>
             </w:r>
-            <w:proofErr w:type="gramStart"/>
             <w:r>
               <w:rPr>
                 <w:rFonts w:cs="Arial"/>
@@ -491,16 +452,7 @@
                 <w:sz w:val="18"/>
                 <w:szCs w:val="18"/>
               </w:rPr>
-              <w:t>nascimento</w:t>
-            </w:r>
-            <w:proofErr w:type="gramEnd"/>
-            <w:r>
-              <w:rPr>
-                <w:rFonts w:cs="Arial"/>
-                <w:sz w:val="18"/>
-                <w:szCs w:val="18"/>
-              </w:rPr>
-              <w:t>_aluno</w:t>
+              <w:t>nascimento_aluno</w:t>
             </w:r>
             <w:proofErr w:type="spellEnd"/>
             <w:r>
@@ -564,7 +516,6 @@
               </w:rPr>
               <w:t xml:space="preserve">: </w:t>
             </w:r>
-            <w:proofErr w:type="gramStart"/>
             <w:r>
               <w:rPr>
                 <w:rFonts w:cs="Arial"/>
@@ -580,16 +531,7 @@
                 <w:sz w:val="18"/>
                 <w:szCs w:val="18"/>
               </w:rPr>
-              <w:t>nascimento</w:t>
-            </w:r>
-            <w:proofErr w:type="gramEnd"/>
-            <w:r>
-              <w:rPr>
-                <w:rFonts w:cs="Arial"/>
-                <w:sz w:val="18"/>
-                <w:szCs w:val="18"/>
-              </w:rPr>
-              <w:t>_contratante</w:t>
+              <w:t>nascimento_contratante</w:t>
             </w:r>
             <w:proofErr w:type="spellEnd"/>
             <w:r>
@@ -630,7 +572,6 @@
               </w:rPr>
               <w:t xml:space="preserve">Telefone: </w:t>
             </w:r>
-            <w:proofErr w:type="gramStart"/>
             <w:r>
               <w:rPr>
                 <w:rFonts w:cs="Arial"/>
@@ -646,16 +587,7 @@
                 <w:sz w:val="18"/>
                 <w:szCs w:val="18"/>
               </w:rPr>
-              <w:t>telefone</w:t>
-            </w:r>
-            <w:proofErr w:type="gramEnd"/>
-            <w:r>
-              <w:rPr>
-                <w:rFonts w:cs="Arial"/>
-                <w:sz w:val="18"/>
-                <w:szCs w:val="18"/>
-              </w:rPr>
-              <w:t>_aluno</w:t>
+              <w:t>telefone_aluno</w:t>
             </w:r>
             <w:proofErr w:type="spellEnd"/>
             <w:r>
@@ -701,7 +633,6 @@
               </w:rPr>
               <w:t xml:space="preserve">Estado civil: </w:t>
             </w:r>
-            <w:proofErr w:type="gramStart"/>
             <w:r>
               <w:rPr>
                 <w:rFonts w:cs="Arial"/>
@@ -717,16 +648,7 @@
                 <w:sz w:val="18"/>
                 <w:szCs w:val="18"/>
               </w:rPr>
-              <w:t>estado</w:t>
-            </w:r>
-            <w:proofErr w:type="gramEnd"/>
-            <w:r>
-              <w:rPr>
-                <w:rFonts w:cs="Arial"/>
-                <w:sz w:val="18"/>
-                <w:szCs w:val="18"/>
-              </w:rPr>
-              <w:t>_civil</w:t>
+              <w:t>estado_civil</w:t>
             </w:r>
             <w:proofErr w:type="spellEnd"/>
             <w:r>
@@ -767,7 +689,6 @@
               </w:rPr>
               <w:t xml:space="preserve">E-mail: </w:t>
             </w:r>
-            <w:proofErr w:type="gramStart"/>
             <w:r>
               <w:rPr>
                 <w:rFonts w:cs="Arial"/>
@@ -783,16 +704,7 @@
                 <w:sz w:val="18"/>
                 <w:szCs w:val="18"/>
               </w:rPr>
-              <w:t>email</w:t>
-            </w:r>
-            <w:proofErr w:type="gramEnd"/>
-            <w:r>
-              <w:rPr>
-                <w:rFonts w:cs="Arial"/>
-                <w:sz w:val="18"/>
-                <w:szCs w:val="18"/>
-              </w:rPr>
-              <w:t>_aluno</w:t>
+              <w:t>email_aluno</w:t>
             </w:r>
             <w:proofErr w:type="spellEnd"/>
             <w:r>
@@ -848,7 +760,6 @@
               </w:rPr>
               <w:t xml:space="preserve">: </w:t>
             </w:r>
-            <w:proofErr w:type="gramStart"/>
             <w:r>
               <w:rPr>
                 <w:rFonts w:cs="Arial"/>
@@ -867,7 +778,6 @@
               <w:t>profissao</w:t>
             </w:r>
             <w:proofErr w:type="spellEnd"/>
-            <w:proofErr w:type="gramEnd"/>
             <w:r>
               <w:rPr>
                 <w:rFonts w:cs="Arial"/>
@@ -906,7 +816,6 @@
               </w:rPr>
               <w:t xml:space="preserve">Escola: </w:t>
             </w:r>
-            <w:proofErr w:type="gramStart"/>
             <w:r>
               <w:rPr>
                 <w:rFonts w:cs="Arial"/>
@@ -925,7 +834,6 @@
               <w:t>escola</w:t>
             </w:r>
             <w:proofErr w:type="spellEnd"/>
-            <w:proofErr w:type="gramEnd"/>
             <w:r>
               <w:rPr>
                 <w:rFonts w:cs="Arial"/>
@@ -969,7 +877,6 @@
               </w:rPr>
               <w:t xml:space="preserve">E-mail: </w:t>
             </w:r>
-            <w:proofErr w:type="gramStart"/>
             <w:r>
               <w:rPr>
                 <w:rFonts w:cs="Arial"/>
@@ -985,16 +892,7 @@
                 <w:sz w:val="18"/>
                 <w:szCs w:val="18"/>
               </w:rPr>
-              <w:t>email</w:t>
-            </w:r>
-            <w:proofErr w:type="gramEnd"/>
-            <w:r>
-              <w:rPr>
-                <w:rFonts w:cs="Arial"/>
-                <w:sz w:val="18"/>
-                <w:szCs w:val="18"/>
-              </w:rPr>
-              <w:t>_contratante</w:t>
+              <w:t>email_contratante</w:t>
             </w:r>
             <w:proofErr w:type="spellEnd"/>
             <w:r>
@@ -1035,7 +933,6 @@
               </w:rPr>
               <w:t xml:space="preserve">Série: </w:t>
             </w:r>
-            <w:proofErr w:type="gramStart"/>
             <w:r>
               <w:rPr>
                 <w:rFonts w:cs="Arial"/>
@@ -1054,7 +951,6 @@
               <w:t>serie</w:t>
             </w:r>
             <w:proofErr w:type="spellEnd"/>
-            <w:proofErr w:type="gramEnd"/>
             <w:r>
               <w:rPr>
                 <w:rFonts w:cs="Arial"/>
@@ -1098,7 +994,6 @@
               </w:rPr>
               <w:t xml:space="preserve">Endereço: </w:t>
             </w:r>
-            <w:proofErr w:type="gramStart"/>
             <w:r>
               <w:rPr>
                 <w:rFonts w:cs="Arial"/>
@@ -1117,7 +1012,6 @@
               <w:t>endereco</w:t>
             </w:r>
             <w:proofErr w:type="spellEnd"/>
-            <w:proofErr w:type="gramEnd"/>
             <w:r>
               <w:rPr>
                 <w:rFonts w:cs="Arial"/>
@@ -1183,23 +1077,13 @@
               </w:rPr>
               <w:t xml:space="preserve">CEP: </w:t>
             </w:r>
-            <w:proofErr w:type="gramStart"/>
             <w:r>
               <w:rPr>
                 <w:rFonts w:cs="Arial"/>
                 <w:sz w:val="18"/>
                 <w:szCs w:val="18"/>
               </w:rPr>
-              <w:t>{{ cep</w:t>
-            </w:r>
-            <w:proofErr w:type="gramEnd"/>
-            <w:r>
-              <w:rPr>
-                <w:rFonts w:cs="Arial"/>
-                <w:sz w:val="18"/>
-                <w:szCs w:val="18"/>
-              </w:rPr>
-              <w:t xml:space="preserve"> }}</w:t>
+              <w:t>{{ cep }}</w:t>
             </w:r>
           </w:p>
         </w:tc>
@@ -1264,16 +1148,7 @@
                 <w:sz w:val="18"/>
                 <w:szCs w:val="18"/>
               </w:rPr>
-              <w:t xml:space="preserve"> </w:t>
-            </w:r>
-            <w:proofErr w:type="gramStart"/>
-            <w:r>
-              <w:rPr>
-                <w:rFonts w:cs="Arial"/>
-                <w:sz w:val="18"/>
-                <w:szCs w:val="18"/>
-              </w:rPr>
-              <w:t xml:space="preserve">{{ </w:t>
+              <w:t xml:space="preserve"> {{ </w:t>
             </w:r>
             <w:proofErr w:type="spellStart"/>
             <w:r>
@@ -1282,16 +1157,7 @@
                 <w:sz w:val="18"/>
                 <w:szCs w:val="18"/>
               </w:rPr>
-              <w:t>telefone</w:t>
-            </w:r>
-            <w:proofErr w:type="gramEnd"/>
-            <w:r>
-              <w:rPr>
-                <w:rFonts w:cs="Arial"/>
-                <w:sz w:val="18"/>
-                <w:szCs w:val="18"/>
-              </w:rPr>
-              <w:t>_contratante</w:t>
+              <w:t>telefone_contratante</w:t>
             </w:r>
             <w:proofErr w:type="spellEnd"/>
             <w:r>
@@ -1960,16 +1826,7 @@
           <w:sz w:val="18"/>
           <w:szCs w:val="18"/>
         </w:rPr>
-        <w:t xml:space="preserve"> de </w:t>
-      </w:r>
-      <w:proofErr w:type="gramStart"/>
-      <w:r>
-        <w:rPr>
-          <w:rFonts w:cs="Arial"/>
-          <w:sz w:val="18"/>
-          <w:szCs w:val="18"/>
-        </w:rPr>
-        <w:t xml:space="preserve">{{ </w:t>
+        <w:t xml:space="preserve"> de {{ </w:t>
       </w:r>
       <w:proofErr w:type="spellStart"/>
       <w:r>
@@ -1978,25 +1835,7 @@
           <w:sz w:val="18"/>
           <w:szCs w:val="18"/>
         </w:rPr>
-        <w:t>mes</w:t>
-      </w:r>
-      <w:proofErr w:type="gramEnd"/>
-      <w:r>
-        <w:rPr>
-          <w:rFonts w:cs="Arial"/>
-          <w:sz w:val="18"/>
-          <w:szCs w:val="18"/>
-        </w:rPr>
-        <w:t>_</w:t>
-      </w:r>
-      <w:proofErr w:type="gramStart"/>
-      <w:r>
-        <w:rPr>
-          <w:rFonts w:cs="Arial"/>
-          <w:sz w:val="18"/>
-          <w:szCs w:val="18"/>
-        </w:rPr>
-        <w:t>inicio</w:t>
+        <w:t>mes_inicio</w:t>
       </w:r>
       <w:proofErr w:type="spellEnd"/>
       <w:r>
@@ -2005,25 +1844,7 @@
           <w:sz w:val="18"/>
           <w:szCs w:val="18"/>
         </w:rPr>
-        <w:t xml:space="preserve"> }</w:t>
-      </w:r>
-      <w:proofErr w:type="gramEnd"/>
-      <w:r>
-        <w:rPr>
-          <w:rFonts w:cs="Arial"/>
-          <w:sz w:val="18"/>
-          <w:szCs w:val="18"/>
-        </w:rPr>
-        <w:t xml:space="preserve">} de </w:t>
-      </w:r>
-      <w:proofErr w:type="gramStart"/>
-      <w:r>
-        <w:rPr>
-          <w:rFonts w:cs="Arial"/>
-          <w:sz w:val="18"/>
-          <w:szCs w:val="18"/>
-        </w:rPr>
-        <w:t xml:space="preserve">{{ </w:t>
+        <w:t xml:space="preserve"> }} de {{ </w:t>
       </w:r>
       <w:proofErr w:type="spellStart"/>
       <w:r>
@@ -2032,25 +1853,7 @@
           <w:sz w:val="18"/>
           <w:szCs w:val="18"/>
         </w:rPr>
-        <w:t>ano</w:t>
-      </w:r>
-      <w:proofErr w:type="gramEnd"/>
-      <w:r>
-        <w:rPr>
-          <w:rFonts w:cs="Arial"/>
-          <w:sz w:val="18"/>
-          <w:szCs w:val="18"/>
-        </w:rPr>
-        <w:t>_</w:t>
-      </w:r>
-      <w:proofErr w:type="gramStart"/>
-      <w:r>
-        <w:rPr>
-          <w:rFonts w:cs="Arial"/>
-          <w:sz w:val="18"/>
-          <w:szCs w:val="18"/>
-        </w:rPr>
-        <w:t>inicio</w:t>
+        <w:t>ano_inicio</w:t>
       </w:r>
       <w:proofErr w:type="spellEnd"/>
       <w:r>
@@ -2059,25 +1862,7 @@
           <w:sz w:val="18"/>
           <w:szCs w:val="18"/>
         </w:rPr>
-        <w:t xml:space="preserve"> }</w:t>
-      </w:r>
-      <w:proofErr w:type="gramEnd"/>
-      <w:r>
-        <w:rPr>
-          <w:rFonts w:cs="Arial"/>
-          <w:sz w:val="18"/>
-          <w:szCs w:val="18"/>
-        </w:rPr>
-        <w:t xml:space="preserve">} a </w:t>
-      </w:r>
-      <w:proofErr w:type="gramStart"/>
-      <w:r>
-        <w:rPr>
-          <w:rFonts w:cs="Arial"/>
-          <w:sz w:val="18"/>
-          <w:szCs w:val="18"/>
-        </w:rPr>
-        <w:t xml:space="preserve">{{ </w:t>
+        <w:t xml:space="preserve"> }} a {{ </w:t>
       </w:r>
       <w:proofErr w:type="spellStart"/>
       <w:r>
@@ -2086,25 +1871,7 @@
           <w:sz w:val="18"/>
           <w:szCs w:val="18"/>
         </w:rPr>
-        <w:t>mes</w:t>
-      </w:r>
-      <w:proofErr w:type="gramEnd"/>
-      <w:r>
-        <w:rPr>
-          <w:rFonts w:cs="Arial"/>
-          <w:sz w:val="18"/>
-          <w:szCs w:val="18"/>
-        </w:rPr>
-        <w:t>_</w:t>
-      </w:r>
-      <w:proofErr w:type="gramStart"/>
-      <w:r>
-        <w:rPr>
-          <w:rFonts w:cs="Arial"/>
-          <w:sz w:val="18"/>
-          <w:szCs w:val="18"/>
-        </w:rPr>
-        <w:t>fim</w:t>
+        <w:t>mes_fim</w:t>
       </w:r>
       <w:proofErr w:type="spellEnd"/>
       <w:r>
@@ -2113,25 +1880,7 @@
           <w:sz w:val="18"/>
           <w:szCs w:val="18"/>
         </w:rPr>
-        <w:t xml:space="preserve"> }</w:t>
-      </w:r>
-      <w:proofErr w:type="gramEnd"/>
-      <w:r>
-        <w:rPr>
-          <w:rFonts w:cs="Arial"/>
-          <w:sz w:val="18"/>
-          <w:szCs w:val="18"/>
-        </w:rPr>
-        <w:t xml:space="preserve">} de </w:t>
-      </w:r>
-      <w:proofErr w:type="gramStart"/>
-      <w:r>
-        <w:rPr>
-          <w:rFonts w:cs="Arial"/>
-          <w:sz w:val="18"/>
-          <w:szCs w:val="18"/>
-        </w:rPr>
-        <w:t xml:space="preserve">{{ </w:t>
+        <w:t xml:space="preserve"> }} de {{ </w:t>
       </w:r>
       <w:proofErr w:type="spellStart"/>
       <w:r>
@@ -2140,25 +1889,7 @@
           <w:sz w:val="18"/>
           <w:szCs w:val="18"/>
         </w:rPr>
-        <w:t>ano</w:t>
-      </w:r>
-      <w:proofErr w:type="gramEnd"/>
-      <w:r>
-        <w:rPr>
-          <w:rFonts w:cs="Arial"/>
-          <w:sz w:val="18"/>
-          <w:szCs w:val="18"/>
-        </w:rPr>
-        <w:t>_</w:t>
-      </w:r>
-      <w:proofErr w:type="gramStart"/>
-      <w:r>
-        <w:rPr>
-          <w:rFonts w:cs="Arial"/>
-          <w:sz w:val="18"/>
-          <w:szCs w:val="18"/>
-        </w:rPr>
-        <w:t>fim</w:t>
+        <w:t>ano_fim</w:t>
       </w:r>
       <w:proofErr w:type="spellEnd"/>
       <w:r>
@@ -2167,24 +1898,15 @@
           <w:sz w:val="18"/>
           <w:szCs w:val="18"/>
         </w:rPr>
-        <w:t xml:space="preserve"> }</w:t>
-      </w:r>
-      <w:proofErr w:type="gramEnd"/>
-      <w:r>
-        <w:rPr>
-          <w:rFonts w:cs="Arial"/>
-          <w:sz w:val="18"/>
-          <w:szCs w:val="18"/>
-        </w:rPr>
-        <w:t>}</w:t>
-      </w:r>
-      <w:r>
-        <w:rPr>
-          <w:rFonts w:cs="Arial"/>
-          <w:sz w:val="18"/>
-          <w:szCs w:val="18"/>
-        </w:rPr>
-        <w:t>, o</w:t>
+        <w:t xml:space="preserve"> }}</w:t>
+      </w:r>
+      <w:r>
+        <w:rPr>
+          <w:rFonts w:cs="Arial"/>
+          <w:sz w:val="18"/>
+          <w:szCs w:val="18"/>
+        </w:rPr>
+        <w:t xml:space="preserve">, </w:t>
       </w:r>
       <w:proofErr w:type="spellStart"/>
       <w:r>
@@ -2193,7 +1915,7 @@
           <w:sz w:val="18"/>
           <w:szCs w:val="18"/>
         </w:rPr>
-        <w:t>u</w:t>
+        <w:t>ou</w:t>
       </w:r>
       <w:proofErr w:type="spellEnd"/>
       <w:r>
@@ -2316,7 +2038,6 @@
         </w:rPr>
         <w:t xml:space="preserve">: </w:t>
       </w:r>
-      <w:proofErr w:type="gramStart"/>
       <w:r>
         <w:rPr>
           <w:rFonts w:cs="Arial"/>
@@ -2332,25 +2053,7 @@
           <w:sz w:val="18"/>
           <w:szCs w:val="18"/>
         </w:rPr>
-        <w:t>forma</w:t>
-      </w:r>
-      <w:proofErr w:type="gramEnd"/>
-      <w:r>
-        <w:rPr>
-          <w:rFonts w:cs="Arial"/>
-          <w:sz w:val="18"/>
-          <w:szCs w:val="18"/>
-        </w:rPr>
-        <w:t>_</w:t>
-      </w:r>
-      <w:proofErr w:type="gramStart"/>
-      <w:r>
-        <w:rPr>
-          <w:rFonts w:cs="Arial"/>
-          <w:sz w:val="18"/>
-          <w:szCs w:val="18"/>
-        </w:rPr>
-        <w:t>pagamento</w:t>
+        <w:t>forma_pagamento</w:t>
       </w:r>
       <w:proofErr w:type="spellEnd"/>
       <w:r>
@@ -2359,16 +2062,7 @@
           <w:sz w:val="18"/>
           <w:szCs w:val="18"/>
         </w:rPr>
-        <w:t xml:space="preserve"> }</w:t>
-      </w:r>
-      <w:proofErr w:type="gramEnd"/>
-      <w:r>
-        <w:rPr>
-          <w:rFonts w:cs="Arial"/>
-          <w:sz w:val="18"/>
-          <w:szCs w:val="18"/>
-        </w:rPr>
-        <w:t>}.</w:t>
+        <w:t xml:space="preserve"> }}.</w:t>
       </w:r>
     </w:p>
     <w:p>
@@ -2407,7 +2101,6 @@
         </w:rPr>
         <w:t xml:space="preserve">: </w:t>
       </w:r>
-      <w:proofErr w:type="gramStart"/>
       <w:r>
         <w:rPr>
           <w:rFonts w:cs="Arial"/>
@@ -2423,25 +2116,7 @@
           <w:sz w:val="18"/>
           <w:szCs w:val="18"/>
         </w:rPr>
-        <w:t>descricao</w:t>
-      </w:r>
-      <w:proofErr w:type="gramEnd"/>
-      <w:r>
-        <w:rPr>
-          <w:rFonts w:cs="Arial"/>
-          <w:sz w:val="18"/>
-          <w:szCs w:val="18"/>
-        </w:rPr>
-        <w:t>_</w:t>
-      </w:r>
-      <w:proofErr w:type="gramStart"/>
-      <w:r>
-        <w:rPr>
-          <w:rFonts w:cs="Arial"/>
-          <w:sz w:val="18"/>
-          <w:szCs w:val="18"/>
-        </w:rPr>
-        <w:t>pacote</w:t>
+        <w:t>descricao_pacote</w:t>
       </w:r>
       <w:proofErr w:type="spellEnd"/>
       <w:r>
@@ -2450,35 +2125,104 @@
           <w:sz w:val="18"/>
           <w:szCs w:val="18"/>
         </w:rPr>
-        <w:t xml:space="preserve"> }</w:t>
-      </w:r>
-      <w:proofErr w:type="gramEnd"/>
-      <w:r>
-        <w:rPr>
-          <w:rFonts w:cs="Arial"/>
-          <w:sz w:val="18"/>
-          <w:szCs w:val="18"/>
-        </w:rPr>
-        <w:t>}.</w:t>
-      </w:r>
-      <w:r>
-        <w:rPr>
-          <w:rFonts w:cs="Arial"/>
-          <w:sz w:val="18"/>
-          <w:szCs w:val="18"/>
-        </w:rPr>
-        <w:t xml:space="preserve"> Valor total </w:t>
-      </w:r>
-      <w:proofErr w:type="gramStart"/>
-      <w:r>
-        <w:rPr>
-          <w:rFonts w:cs="Arial"/>
-          <w:sz w:val="18"/>
-          <w:szCs w:val="18"/>
-        </w:rPr>
-        <w:t>do</w:t>
-      </w:r>
-      <w:proofErr w:type="gramEnd"/>
+        <w:t xml:space="preserve"> }}.</w:t>
+      </w:r>
+      <w:r>
+        <w:rPr>
+          <w:rFonts w:cs="Arial"/>
+          <w:sz w:val="18"/>
+          <w:szCs w:val="18"/>
+        </w:rPr>
+        <w:t xml:space="preserve"> Valor total do </w:t>
+      </w:r>
+      <w:proofErr w:type="spellStart"/>
+      <w:r>
+        <w:rPr>
+          <w:rFonts w:cs="Arial"/>
+          <w:sz w:val="18"/>
+          <w:szCs w:val="18"/>
+        </w:rPr>
+        <w:t>curso</w:t>
+      </w:r>
+      <w:proofErr w:type="spellEnd"/>
+      <w:r>
+        <w:rPr>
+          <w:rFonts w:cs="Arial"/>
+          <w:sz w:val="18"/>
+          <w:szCs w:val="18"/>
+        </w:rPr>
+        <w:t xml:space="preserve">: </w:t>
+      </w:r>
+      <w:r>
+        <w:rPr>
+          <w:rFonts w:cs="Arial"/>
+          <w:sz w:val="18"/>
+          <w:szCs w:val="18"/>
+        </w:rPr>
+        <w:t xml:space="preserve">R$ {{ </w:t>
+      </w:r>
+      <w:proofErr w:type="spellStart"/>
+      <w:r>
+        <w:rPr>
+          <w:rFonts w:cs="Arial"/>
+          <w:sz w:val="18"/>
+          <w:szCs w:val="18"/>
+        </w:rPr>
+        <w:t>valor_total</w:t>
+      </w:r>
+      <w:proofErr w:type="spellEnd"/>
+      <w:r>
+        <w:rPr>
+          <w:rFonts w:cs="Arial"/>
+          <w:sz w:val="18"/>
+          <w:szCs w:val="18"/>
+        </w:rPr>
+        <w:t xml:space="preserve"> }}</w:t>
+      </w:r>
+      <w:r>
+        <w:rPr>
+          <w:rFonts w:cs="Arial"/>
+          <w:sz w:val="18"/>
+          <w:szCs w:val="18"/>
+        </w:rPr>
+        <w:t xml:space="preserve">{% if </w:t>
+      </w:r>
+      <w:proofErr w:type="spellStart"/>
+      <w:r>
+        <w:rPr>
+          <w:rFonts w:cs="Arial"/>
+          <w:sz w:val="18"/>
+          <w:szCs w:val="18"/>
+        </w:rPr>
+        <w:t>eh_parcelado</w:t>
+      </w:r>
+      <w:proofErr w:type="spellEnd"/>
+      <w:r>
+        <w:rPr>
+          <w:rFonts w:cs="Arial"/>
+          <w:sz w:val="18"/>
+          <w:szCs w:val="18"/>
+        </w:rPr>
+        <w:t xml:space="preserve"> %}</w:t>
+      </w:r>
+      <w:r>
+        <w:rPr>
+          <w:rFonts w:cs="Arial"/>
+          <w:sz w:val="18"/>
+          <w:szCs w:val="18"/>
+        </w:rPr>
+        <w:t>, p</w:t>
+      </w:r>
+      <w:proofErr w:type="spellStart"/>
+      <w:r>
+        <w:rPr>
+          <w:rFonts w:cs="Arial"/>
+          <w:sz w:val="18"/>
+          <w:szCs w:val="18"/>
+        </w:rPr>
+        <w:t>arcelado</w:t>
+      </w:r>
+      <w:proofErr w:type="spellEnd"/>
       <w:r>
         <w:rPr>
           <w:rFonts w:cs="Arial"/>
@@ -2494,7 +2238,7 @@
           <w:sz w:val="18"/>
           <w:szCs w:val="18"/>
         </w:rPr>
-        <w:t>curso</w:t>
+        <w:t>em</w:t>
       </w:r>
       <w:proofErr w:type="spellEnd"/>
       <w:r>
@@ -2503,17 +2247,8 @@
           <w:sz w:val="18"/>
           <w:szCs w:val="18"/>
         </w:rPr>
-        <w:t xml:space="preserve">: </w:t>
-      </w:r>
-      <w:r>
-        <w:rPr>
-          <w:rFonts w:cs="Arial"/>
-          <w:sz w:val="18"/>
-          <w:szCs w:val="18"/>
-        </w:rPr>
-        <w:t xml:space="preserve">R$ </w:t>
-      </w:r>
-      <w:proofErr w:type="gramStart"/>
+        <w:t xml:space="preserve"> </w:t>
+      </w:r>
       <w:r>
         <w:rPr>
           <w:rFonts w:cs="Arial"/>
@@ -2529,25 +2264,7 @@
           <w:sz w:val="18"/>
           <w:szCs w:val="18"/>
         </w:rPr>
-        <w:t>valor</w:t>
-      </w:r>
-      <w:proofErr w:type="gramEnd"/>
-      <w:r>
-        <w:rPr>
-          <w:rFonts w:cs="Arial"/>
-          <w:sz w:val="18"/>
-          <w:szCs w:val="18"/>
-        </w:rPr>
-        <w:t>_</w:t>
-      </w:r>
-      <w:proofErr w:type="gramStart"/>
-      <w:r>
-        <w:rPr>
-          <w:rFonts w:cs="Arial"/>
-          <w:sz w:val="18"/>
-          <w:szCs w:val="18"/>
-        </w:rPr>
-        <w:t>total</w:t>
+        <w:t>num_parcelas</w:t>
       </w:r>
       <w:proofErr w:type="spellEnd"/>
       <w:r>
@@ -2556,16 +2273,59 @@
           <w:sz w:val="18"/>
           <w:szCs w:val="18"/>
         </w:rPr>
-        <w:t xml:space="preserve"> }</w:t>
-      </w:r>
-      <w:proofErr w:type="gramEnd"/>
-      <w:r>
-        <w:rPr>
-          <w:rFonts w:cs="Arial"/>
-          <w:sz w:val="18"/>
-          <w:szCs w:val="18"/>
-        </w:rPr>
-        <w:t>}</w:t>
+        <w:t xml:space="preserve"> }}</w:t>
+      </w:r>
+      <w:r>
+        <w:rPr>
+          <w:rFonts w:cs="Arial"/>
+          <w:sz w:val="18"/>
+          <w:szCs w:val="18"/>
+        </w:rPr>
+        <w:t xml:space="preserve"> </w:t>
+      </w:r>
+      <w:proofErr w:type="spellStart"/>
+      <w:r>
+        <w:rPr>
+          <w:rFonts w:cs="Arial"/>
+          <w:sz w:val="18"/>
+          <w:szCs w:val="18"/>
+        </w:rPr>
+        <w:t>vezes</w:t>
+      </w:r>
+      <w:proofErr w:type="spellEnd"/>
+      <w:r>
+        <w:rPr>
+          <w:rFonts w:cs="Arial"/>
+          <w:sz w:val="18"/>
+          <w:szCs w:val="18"/>
+        </w:rPr>
+        <w:t xml:space="preserve"> de R$ </w:t>
+      </w:r>
+      <w:r>
+        <w:rPr>
+          <w:rFonts w:cs="Arial"/>
+          <w:sz w:val="18"/>
+          <w:szCs w:val="18"/>
+        </w:rPr>
+        <w:t xml:space="preserve">{{ </w:t>
+      </w:r>
+      <w:proofErr w:type="spellStart"/>
+      <w:r>
+        <w:rPr>
+          <w:rFonts w:cs="Arial"/>
+          <w:sz w:val="18"/>
+          <w:szCs w:val="18"/>
+        </w:rPr>
+        <w:t>valor_parcela</w:t>
+      </w:r>
+      <w:proofErr w:type="spellEnd"/>
+      <w:r>
+        <w:rPr>
+          <w:rFonts w:cs="Arial"/>
+          <w:sz w:val="18"/>
+          <w:szCs w:val="18"/>
+        </w:rPr>
+        <w:t xml:space="preserve"> }}</w:t>
       </w:r>
       <w:r>
         <w:rPr>
@@ -2582,7 +2342,7 @@
           <w:sz w:val="18"/>
           <w:szCs w:val="18"/>
         </w:rPr>
-        <w:t>parcelado</w:t>
+        <w:t>sendo</w:t>
       </w:r>
       <w:proofErr w:type="spellEnd"/>
       <w:r>
@@ -2591,6 +2351,24 @@
           <w:sz w:val="18"/>
           <w:szCs w:val="18"/>
         </w:rPr>
+        <w:t xml:space="preserve"> a </w:t>
+      </w:r>
+      <w:proofErr w:type="spellStart"/>
+      <w:r>
+        <w:rPr>
+          <w:rFonts w:cs="Arial"/>
+          <w:sz w:val="18"/>
+          <w:szCs w:val="18"/>
+        </w:rPr>
+        <w:t>primeira</w:t>
+      </w:r>
+      <w:proofErr w:type="spellEnd"/>
+      <w:r>
+        <w:rPr>
+          <w:rFonts w:cs="Arial"/>
+          <w:sz w:val="18"/>
+          <w:szCs w:val="18"/>
+        </w:rPr>
         <w:t xml:space="preserve"> </w:t>
       </w:r>
       <w:proofErr w:type="spellStart"/>
@@ -2600,6 +2378,42 @@
           <w:sz w:val="18"/>
           <w:szCs w:val="18"/>
         </w:rPr>
+        <w:t>parcela</w:t>
+      </w:r>
+      <w:proofErr w:type="spellEnd"/>
+      <w:r>
+        <w:rPr>
+          <w:rFonts w:cs="Arial"/>
+          <w:sz w:val="18"/>
+          <w:szCs w:val="18"/>
+        </w:rPr>
+        <w:t xml:space="preserve"> com </w:t>
+      </w:r>
+      <w:proofErr w:type="spellStart"/>
+      <w:r>
+        <w:rPr>
+          <w:rFonts w:cs="Arial"/>
+          <w:sz w:val="18"/>
+          <w:szCs w:val="18"/>
+        </w:rPr>
+        <w:t>vencimento</w:t>
+      </w:r>
+      <w:proofErr w:type="spellEnd"/>
+      <w:r>
+        <w:rPr>
+          <w:rFonts w:cs="Arial"/>
+          <w:sz w:val="18"/>
+          <w:szCs w:val="18"/>
+        </w:rPr>
+        <w:t xml:space="preserve"> </w:t>
+      </w:r>
+      <w:proofErr w:type="spellStart"/>
+      <w:r>
+        <w:rPr>
+          <w:rFonts w:cs="Arial"/>
+          <w:sz w:val="18"/>
+          <w:szCs w:val="18"/>
+        </w:rPr>
         <w:t>em</w:t>
       </w:r>
       <w:proofErr w:type="spellEnd"/>
@@ -2611,7 +2425,6 @@
         </w:rPr>
         <w:t xml:space="preserve"> </w:t>
       </w:r>
-      <w:proofErr w:type="gramStart"/>
       <w:r>
         <w:rPr>
           <w:rFonts w:cs="Arial"/>
@@ -2627,25 +2440,7 @@
           <w:sz w:val="18"/>
           <w:szCs w:val="18"/>
         </w:rPr>
-        <w:t>num</w:t>
-      </w:r>
-      <w:proofErr w:type="gramEnd"/>
-      <w:r>
-        <w:rPr>
-          <w:rFonts w:cs="Arial"/>
-          <w:sz w:val="18"/>
-          <w:szCs w:val="18"/>
-        </w:rPr>
-        <w:t>_</w:t>
-      </w:r>
-      <w:proofErr w:type="gramStart"/>
-      <w:r>
-        <w:rPr>
-          <w:rFonts w:cs="Arial"/>
-          <w:sz w:val="18"/>
-          <w:szCs w:val="18"/>
-        </w:rPr>
-        <w:t>parcelas</w:t>
+        <w:t>data_primeira_parcela</w:t>
       </w:r>
       <w:proofErr w:type="spellEnd"/>
       <w:r>
@@ -2654,17 +2449,26 @@
           <w:sz w:val="18"/>
           <w:szCs w:val="18"/>
         </w:rPr>
-        <w:t xml:space="preserve"> }</w:t>
-      </w:r>
-      <w:proofErr w:type="gramEnd"/>
-      <w:r>
-        <w:rPr>
-          <w:rFonts w:cs="Arial"/>
-          <w:sz w:val="18"/>
-          <w:szCs w:val="18"/>
-        </w:rPr>
-        <w:t>}</w:t>
-      </w:r>
+        <w:t xml:space="preserve"> }}</w:t>
+      </w:r>
+      <w:r>
+        <w:rPr>
+          <w:rFonts w:cs="Arial"/>
+          <w:sz w:val="18"/>
+          <w:szCs w:val="18"/>
+        </w:rPr>
+        <w:t xml:space="preserve"> e a </w:t>
+      </w:r>
+      <w:proofErr w:type="spellStart"/>
+      <w:r>
+        <w:rPr>
+          <w:rFonts w:cs="Arial"/>
+          <w:sz w:val="18"/>
+          <w:szCs w:val="18"/>
+        </w:rPr>
+        <w:t>última</w:t>
+      </w:r>
+      <w:proofErr w:type="spellEnd"/>
       <w:r>
         <w:rPr>
           <w:rFonts w:cs="Arial"/>
@@ -2680,7 +2484,7 @@
           <w:sz w:val="18"/>
           <w:szCs w:val="18"/>
         </w:rPr>
-        <w:t>vezes</w:t>
+        <w:t>em</w:t>
       </w:r>
       <w:proofErr w:type="spellEnd"/>
       <w:r>
@@ -2689,9 +2493,8 @@
           <w:sz w:val="18"/>
           <w:szCs w:val="18"/>
         </w:rPr>
-        <w:t xml:space="preserve"> de R$ </w:t>
-      </w:r>
-      <w:proofErr w:type="gramStart"/>
+        <w:t xml:space="preserve"> </w:t>
+      </w:r>
       <w:r>
         <w:rPr>
           <w:rFonts w:cs="Arial"/>
@@ -2707,25 +2510,7 @@
           <w:sz w:val="18"/>
           <w:szCs w:val="18"/>
         </w:rPr>
-        <w:t>valor</w:t>
-      </w:r>
-      <w:proofErr w:type="gramEnd"/>
-      <w:r>
-        <w:rPr>
-          <w:rFonts w:cs="Arial"/>
-          <w:sz w:val="18"/>
-          <w:szCs w:val="18"/>
-        </w:rPr>
-        <w:t>_</w:t>
-      </w:r>
-      <w:proofErr w:type="gramStart"/>
-      <w:r>
-        <w:rPr>
-          <w:rFonts w:cs="Arial"/>
-          <w:sz w:val="18"/>
-          <w:szCs w:val="18"/>
-        </w:rPr>
-        <w:t>parcela</w:t>
+        <w:t>data_ultima_parcela</w:t>
       </w:r>
       <w:proofErr w:type="spellEnd"/>
       <w:r>
@@ -2734,24 +2519,31 @@
           <w:sz w:val="18"/>
           <w:szCs w:val="18"/>
         </w:rPr>
-        <w:t xml:space="preserve"> }</w:t>
-      </w:r>
-      <w:proofErr w:type="gramEnd"/>
-      <w:r>
-        <w:rPr>
-          <w:rFonts w:cs="Arial"/>
-          <w:sz w:val="18"/>
-          <w:szCs w:val="18"/>
-        </w:rPr>
-        <w:t>}</w:t>
-      </w:r>
-      <w:r>
-        <w:rPr>
-          <w:rFonts w:cs="Arial"/>
-          <w:sz w:val="18"/>
-          <w:szCs w:val="18"/>
-        </w:rPr>
-        <w:t>, s</w:t>
+        <w:t xml:space="preserve"> }}</w:t>
+      </w:r>
+      <w:r>
+        <w:rPr>
+          <w:rFonts w:cs="Arial"/>
+          <w:sz w:val="18"/>
+          <w:szCs w:val="18"/>
+        </w:rPr>
+        <w:t>{% endif %}</w:t>
+      </w:r>
+      <w:r>
+        <w:rPr>
+          <w:rFonts w:cs="Arial"/>
+          <w:sz w:val="18"/>
+          <w:szCs w:val="18"/>
+        </w:rPr>
+        <w:t xml:space="preserve">, </w:t>
+      </w:r>
+      <w:r>
+        <w:rPr>
+          <w:rFonts w:cs="Arial"/>
+          <w:sz w:val="18"/>
+          <w:szCs w:val="18"/>
+        </w:rPr>
+        <w:t xml:space="preserve">{{ </w:t>
       </w:r>
       <w:proofErr w:type="spellStart"/>
       <w:r>
@@ -2760,7 +2552,7 @@
           <w:sz w:val="18"/>
           <w:szCs w:val="18"/>
         </w:rPr>
-        <w:t>endo</w:t>
+        <w:t>detalhe_isencao</w:t>
       </w:r>
       <w:proofErr w:type="spellEnd"/>
       <w:r>
@@ -2769,257 +2561,7 @@
           <w:sz w:val="18"/>
           <w:szCs w:val="18"/>
         </w:rPr>
-        <w:t xml:space="preserve"> a primeira parcela com </w:t>
-      </w:r>
-      <w:proofErr w:type="spellStart"/>
-      <w:r>
-        <w:rPr>
-          <w:rFonts w:cs="Arial"/>
-          <w:sz w:val="18"/>
-          <w:szCs w:val="18"/>
-        </w:rPr>
-        <w:t>vencimento</w:t>
-      </w:r>
-      <w:proofErr w:type="spellEnd"/>
-      <w:r>
-        <w:rPr>
-          <w:rFonts w:cs="Arial"/>
-          <w:sz w:val="18"/>
-          <w:szCs w:val="18"/>
-        </w:rPr>
-        <w:t xml:space="preserve"> </w:t>
-      </w:r>
-      <w:proofErr w:type="spellStart"/>
-      <w:r>
-        <w:rPr>
-          <w:rFonts w:cs="Arial"/>
-          <w:sz w:val="18"/>
-          <w:szCs w:val="18"/>
-        </w:rPr>
-        <w:t>em</w:t>
-      </w:r>
-      <w:proofErr w:type="spellEnd"/>
-      <w:r>
-        <w:rPr>
-          <w:rFonts w:cs="Arial"/>
-          <w:sz w:val="18"/>
-          <w:szCs w:val="18"/>
-        </w:rPr>
-        <w:t xml:space="preserve"> </w:t>
-      </w:r>
-      <w:proofErr w:type="gramStart"/>
-      <w:r>
-        <w:rPr>
-          <w:rFonts w:cs="Arial"/>
-          <w:sz w:val="18"/>
-          <w:szCs w:val="18"/>
-        </w:rPr>
-        <w:t xml:space="preserve">{{ </w:t>
-      </w:r>
-      <w:proofErr w:type="spellStart"/>
-      <w:r>
-        <w:rPr>
-          <w:rFonts w:cs="Arial"/>
-          <w:sz w:val="18"/>
-          <w:szCs w:val="18"/>
-        </w:rPr>
-        <w:t>data</w:t>
-      </w:r>
-      <w:proofErr w:type="gramEnd"/>
-      <w:r>
-        <w:rPr>
-          <w:rFonts w:cs="Arial"/>
-          <w:sz w:val="18"/>
-          <w:szCs w:val="18"/>
-        </w:rPr>
-        <w:t>_primeira_</w:t>
-      </w:r>
-      <w:proofErr w:type="gramStart"/>
-      <w:r>
-        <w:rPr>
-          <w:rFonts w:cs="Arial"/>
-          <w:sz w:val="18"/>
-          <w:szCs w:val="18"/>
-        </w:rPr>
-        <w:t>parcela</w:t>
-      </w:r>
-      <w:proofErr w:type="spellEnd"/>
-      <w:r>
-        <w:rPr>
-          <w:rFonts w:cs="Arial"/>
-          <w:sz w:val="18"/>
-          <w:szCs w:val="18"/>
-        </w:rPr>
-        <w:t xml:space="preserve"> }</w:t>
-      </w:r>
-      <w:proofErr w:type="gramEnd"/>
-      <w:r>
-        <w:rPr>
-          <w:rFonts w:cs="Arial"/>
-          <w:sz w:val="18"/>
-          <w:szCs w:val="18"/>
-        </w:rPr>
-        <w:t>}</w:t>
-      </w:r>
-      <w:r>
-        <w:rPr>
-          <w:rFonts w:cs="Arial"/>
-          <w:sz w:val="18"/>
-          <w:szCs w:val="18"/>
-        </w:rPr>
-        <w:t xml:space="preserve"> e a </w:t>
-      </w:r>
-      <w:proofErr w:type="spellStart"/>
-      <w:r>
-        <w:rPr>
-          <w:rFonts w:cs="Arial"/>
-          <w:sz w:val="18"/>
-          <w:szCs w:val="18"/>
-        </w:rPr>
-        <w:t>última</w:t>
-      </w:r>
-      <w:proofErr w:type="spellEnd"/>
-      <w:r>
-        <w:rPr>
-          <w:rFonts w:cs="Arial"/>
-          <w:sz w:val="18"/>
-          <w:szCs w:val="18"/>
-        </w:rPr>
-        <w:t xml:space="preserve"> </w:t>
-      </w:r>
-      <w:proofErr w:type="spellStart"/>
-      <w:r>
-        <w:rPr>
-          <w:rFonts w:cs="Arial"/>
-          <w:sz w:val="18"/>
-          <w:szCs w:val="18"/>
-        </w:rPr>
-        <w:t>em</w:t>
-      </w:r>
-      <w:proofErr w:type="spellEnd"/>
-      <w:r>
-        <w:rPr>
-          <w:rFonts w:cs="Arial"/>
-          <w:sz w:val="18"/>
-          <w:szCs w:val="18"/>
-        </w:rPr>
-        <w:t xml:space="preserve"> </w:t>
-      </w:r>
-      <w:proofErr w:type="gramStart"/>
-      <w:r>
-        <w:rPr>
-          <w:rFonts w:cs="Arial"/>
-          <w:sz w:val="18"/>
-          <w:szCs w:val="18"/>
-        </w:rPr>
-        <w:t xml:space="preserve">{{ </w:t>
-      </w:r>
-      <w:proofErr w:type="spellStart"/>
-      <w:r>
-        <w:rPr>
-          <w:rFonts w:cs="Arial"/>
-          <w:sz w:val="18"/>
-          <w:szCs w:val="18"/>
-        </w:rPr>
-        <w:t>data</w:t>
-      </w:r>
-      <w:proofErr w:type="gramEnd"/>
-      <w:r>
-        <w:rPr>
-          <w:rFonts w:cs="Arial"/>
-          <w:sz w:val="18"/>
-          <w:szCs w:val="18"/>
-        </w:rPr>
-        <w:t>_ultima_</w:t>
-      </w:r>
-      <w:proofErr w:type="gramStart"/>
-      <w:r>
-        <w:rPr>
-          <w:rFonts w:cs="Arial"/>
-          <w:sz w:val="18"/>
-          <w:szCs w:val="18"/>
-        </w:rPr>
-        <w:t>parcela</w:t>
-      </w:r>
-      <w:proofErr w:type="spellEnd"/>
-      <w:r>
-        <w:rPr>
-          <w:rFonts w:cs="Arial"/>
-          <w:sz w:val="18"/>
-          <w:szCs w:val="18"/>
-        </w:rPr>
-        <w:t xml:space="preserve"> }</w:t>
-      </w:r>
-      <w:proofErr w:type="gramEnd"/>
-      <w:r>
-        <w:rPr>
-          <w:rFonts w:cs="Arial"/>
-          <w:sz w:val="18"/>
-          <w:szCs w:val="18"/>
-        </w:rPr>
-        <w:t>}</w:t>
-      </w:r>
-      <w:r>
-        <w:rPr>
-          <w:rFonts w:cs="Arial"/>
-          <w:sz w:val="18"/>
-          <w:szCs w:val="18"/>
-        </w:rPr>
-        <w:t xml:space="preserve">, </w:t>
-      </w:r>
-      <w:proofErr w:type="gramStart"/>
-      <w:r>
-        <w:rPr>
-          <w:rFonts w:cs="Arial"/>
-          <w:sz w:val="18"/>
-          <w:szCs w:val="18"/>
-        </w:rPr>
-        <w:t xml:space="preserve">{{ </w:t>
-      </w:r>
-      <w:proofErr w:type="spellStart"/>
-      <w:r>
-        <w:rPr>
-          <w:rFonts w:cs="Arial"/>
-          <w:sz w:val="18"/>
-          <w:szCs w:val="18"/>
-        </w:rPr>
-        <w:t>detalhe</w:t>
-      </w:r>
-      <w:proofErr w:type="gramEnd"/>
-      <w:r>
-        <w:rPr>
-          <w:rFonts w:cs="Arial"/>
-          <w:sz w:val="18"/>
-          <w:szCs w:val="18"/>
-        </w:rPr>
-        <w:t>_</w:t>
-      </w:r>
-      <w:proofErr w:type="gramStart"/>
-      <w:r>
-        <w:rPr>
-          <w:rFonts w:cs="Arial"/>
-          <w:sz w:val="18"/>
-          <w:szCs w:val="18"/>
-        </w:rPr>
-        <w:t>isencao</w:t>
-      </w:r>
-      <w:proofErr w:type="spellEnd"/>
-      <w:r>
-        <w:rPr>
-          <w:rFonts w:cs="Arial"/>
-          <w:sz w:val="18"/>
-          <w:szCs w:val="18"/>
-        </w:rPr>
-        <w:t xml:space="preserve"> }</w:t>
-      </w:r>
-      <w:proofErr w:type="gramEnd"/>
-      <w:r>
-        <w:rPr>
-          <w:rFonts w:cs="Arial"/>
-          <w:sz w:val="18"/>
-          <w:szCs w:val="18"/>
-        </w:rPr>
-        <w:t>}</w:t>
+        <w:t xml:space="preserve"> }}</w:t>
       </w:r>
       <w:r>
         <w:rPr>
@@ -3237,25 +2779,7 @@
           <w:sz w:val="18"/>
           <w:szCs w:val="18"/>
         </w:rPr>
-        <w:t xml:space="preserve">5.4. A suspensão ou rescisão por inadimplência não afasta </w:t>
-      </w:r>
-      <w:proofErr w:type="gramStart"/>
-      <w:r>
-        <w:rPr>
-          <w:rFonts w:cs="Arial"/>
-          <w:sz w:val="18"/>
-          <w:szCs w:val="18"/>
-        </w:rPr>
-        <w:t>a</w:t>
-      </w:r>
-      <w:proofErr w:type="gramEnd"/>
-      <w:r>
-        <w:rPr>
-          <w:rFonts w:cs="Arial"/>
-          <w:sz w:val="18"/>
-          <w:szCs w:val="18"/>
-        </w:rPr>
-        <w:t xml:space="preserve"> exigibilidade dos valores já vencidos, dos encargos moratórios e das demais obrigações financeiras assumidas.</w:t>
+        <w:t>5.4. A suspensão ou rescisão por inadimplência não afasta a exigibilidade dos valores já vencidos, dos encargos moratórios e das demais obrigações financeiras assumidas.</w:t>
       </w:r>
     </w:p>
     <w:p>
@@ -3274,25 +2798,7 @@
           <w:sz w:val="18"/>
           <w:szCs w:val="18"/>
         </w:rPr>
-        <w:t xml:space="preserve">5.5. </w:t>
-      </w:r>
-      <w:proofErr w:type="gramStart"/>
-      <w:r>
-        <w:rPr>
-          <w:rFonts w:cs="Arial"/>
-          <w:sz w:val="18"/>
-          <w:szCs w:val="18"/>
-        </w:rPr>
-        <w:t>A</w:t>
-      </w:r>
-      <w:proofErr w:type="gramEnd"/>
-      <w:r>
-        <w:rPr>
-          <w:rFonts w:cs="Arial"/>
-          <w:sz w:val="18"/>
-          <w:szCs w:val="18"/>
-        </w:rPr>
-        <w:t xml:space="preserve"> eventual tolerância da CONTRATADA quanto ao atraso, ao parcelamento em atraso ou à continuidade temporária do atendimento não importará novação, renúncia, perdão da dívida ou alteração contratual tácita.</w:t>
+        <w:t>5.5. A eventual tolerância da CONTRATADA quanto ao atraso, ao parcelamento em atraso ou à continuidade temporária do atendimento não importará novação, renúncia, perdão da dívida ou alteração contratual tácita.</w:t>
       </w:r>
     </w:p>
     <w:p>
@@ -3350,25 +2856,7 @@
           <w:sz w:val="18"/>
           <w:szCs w:val="18"/>
         </w:rPr>
-        <w:t xml:space="preserve">6.2. Salvo previsão promocional expressa de isenção, a </w:t>
-      </w:r>
-      <w:proofErr w:type="gramStart"/>
-      <w:r>
-        <w:rPr>
-          <w:rFonts w:cs="Arial"/>
-          <w:sz w:val="18"/>
-          <w:szCs w:val="18"/>
-        </w:rPr>
-        <w:t>taxa</w:t>
-      </w:r>
-      <w:proofErr w:type="gramEnd"/>
-      <w:r>
-        <w:rPr>
-          <w:rFonts w:cs="Arial"/>
-          <w:sz w:val="18"/>
-          <w:szCs w:val="18"/>
-        </w:rPr>
-        <w:t xml:space="preserve"> de matrícula não será restituída após a confirmação da contratação.</w:t>
+        <w:t>6.2. Salvo previsão promocional expressa de isenção, a taxa de matrícula não será restituída após a confirmação da contratação.</w:t>
       </w:r>
     </w:p>
     <w:p>
@@ -3561,25 +3049,7 @@
           <w:sz w:val="18"/>
           <w:szCs w:val="18"/>
         </w:rPr>
-        <w:t xml:space="preserve">8.5. O curso poderá adotar atividades presenciais, híbridas, de apoio remoto, plataformas digitais, grupos de comunicação, simulados, monitorias e outras ferramentas complementares, conforme o pacote contratado e </w:t>
-      </w:r>
-      <w:proofErr w:type="gramStart"/>
-      <w:r>
-        <w:rPr>
-          <w:rFonts w:cs="Arial"/>
-          <w:sz w:val="18"/>
-          <w:szCs w:val="18"/>
-        </w:rPr>
-        <w:t>a</w:t>
-      </w:r>
-      <w:proofErr w:type="gramEnd"/>
-      <w:r>
-        <w:rPr>
-          <w:rFonts w:cs="Arial"/>
-          <w:sz w:val="18"/>
-          <w:szCs w:val="18"/>
-        </w:rPr>
-        <w:t xml:space="preserve"> organização da instituição.</w:t>
+        <w:t>8.5. O curso poderá adotar atividades presenciais, híbridas, de apoio remoto, plataformas digitais, grupos de comunicação, simulados, monitorias e outras ferramentas complementares, conforme o pacote contratado e a organização da instituição.</w:t>
       </w:r>
     </w:p>
     <w:p>
@@ -4157,25 +3627,7 @@
           <w:sz w:val="18"/>
           <w:szCs w:val="18"/>
         </w:rPr>
-        <w:t xml:space="preserve">15.3. </w:t>
-      </w:r>
-      <w:proofErr w:type="gramStart"/>
-      <w:r>
-        <w:rPr>
-          <w:rFonts w:cs="Arial"/>
-          <w:sz w:val="18"/>
-          <w:szCs w:val="18"/>
-        </w:rPr>
-        <w:t>A</w:t>
-      </w:r>
-      <w:proofErr w:type="gramEnd"/>
-      <w:r>
-        <w:rPr>
-          <w:rFonts w:cs="Arial"/>
-          <w:sz w:val="18"/>
-          <w:szCs w:val="18"/>
-        </w:rPr>
-        <w:t xml:space="preserve"> inexistência de vaga ou de disponibilidade operacional desobriga a CONTRATADA de realizar qualquer remanejamento solicitado pelo CONTRATANTE.</w:t>
+        <w:t>15.3. A inexistência de vaga ou de disponibilidade operacional desobriga a CONTRATADA de realizar qualquer remanejamento solicitado pelo CONTRATANTE.</w:t>
       </w:r>
     </w:p>
     <w:p>
@@ -4214,7 +3666,7 @@
           <w:sz w:val="18"/>
           <w:szCs w:val="18"/>
         </w:rPr>
-        <w:t xml:space="preserve">16.1. As comunicações entre as partes poderão ser realizadas por escrito, inclusive </w:t>
+        <w:t xml:space="preserve">16.1. As comunicações entre as partes poderão ser realizadas </w:t>
       </w:r>
       <w:proofErr w:type="spellStart"/>
       <w:r>
@@ -4232,6 +3684,42 @@
           <w:sz w:val="18"/>
           <w:szCs w:val="18"/>
         </w:rPr>
+        <w:t xml:space="preserve"> </w:t>
+      </w:r>
+      <w:proofErr w:type="spellStart"/>
+      <w:r>
+        <w:rPr>
+          <w:rFonts w:cs="Arial"/>
+          <w:sz w:val="18"/>
+          <w:szCs w:val="18"/>
+        </w:rPr>
+        <w:t>escrito</w:t>
+      </w:r>
+      <w:proofErr w:type="spellEnd"/>
+      <w:r>
+        <w:rPr>
+          <w:rFonts w:cs="Arial"/>
+          <w:sz w:val="18"/>
+          <w:szCs w:val="18"/>
+        </w:rPr>
+        <w:t xml:space="preserve">, inclusive </w:t>
+      </w:r>
+      <w:proofErr w:type="spellStart"/>
+      <w:r>
+        <w:rPr>
+          <w:rFonts w:cs="Arial"/>
+          <w:sz w:val="18"/>
+          <w:szCs w:val="18"/>
+        </w:rPr>
+        <w:t>por</w:t>
+      </w:r>
+      <w:proofErr w:type="spellEnd"/>
+      <w:r>
+        <w:rPr>
+          <w:rFonts w:cs="Arial"/>
+          <w:sz w:val="18"/>
+          <w:szCs w:val="18"/>
+        </w:rPr>
         <w:t xml:space="preserve"> WhatsApp, e-mail, </w:t>
       </w:r>
       <w:proofErr w:type="spellStart"/>
@@ -4358,7 +3846,25 @@
           <w:sz w:val="18"/>
           <w:szCs w:val="18"/>
         </w:rPr>
-        <w:t xml:space="preserve"> dados informados pelo CONTRATANTE.</w:t>
+        <w:t xml:space="preserve"> dados </w:t>
+      </w:r>
+      <w:proofErr w:type="spellStart"/>
+      <w:r>
+        <w:rPr>
+          <w:rFonts w:cs="Arial"/>
+          <w:sz w:val="18"/>
+          <w:szCs w:val="18"/>
+        </w:rPr>
+        <w:t>informados</w:t>
+      </w:r>
+      <w:proofErr w:type="spellEnd"/>
+      <w:r>
+        <w:rPr>
+          <w:rFonts w:cs="Arial"/>
+          <w:sz w:val="18"/>
+          <w:szCs w:val="18"/>
+        </w:rPr>
+        <w:t xml:space="preserve"> pelo CONTRATANTE.</w:t>
       </w:r>
     </w:p>
     <w:p>
@@ -4570,43 +4076,7 @@
           <w:sz w:val="18"/>
           <w:szCs w:val="18"/>
         </w:rPr>
-        <w:t xml:space="preserve">19.1. </w:t>
-      </w:r>
-      <w:proofErr w:type="gramStart"/>
-      <w:r>
-        <w:rPr>
-          <w:rFonts w:cs="Arial"/>
-          <w:sz w:val="18"/>
-          <w:szCs w:val="18"/>
-        </w:rPr>
-        <w:t>A</w:t>
-      </w:r>
-      <w:proofErr w:type="gramEnd"/>
-      <w:r>
-        <w:rPr>
-          <w:rFonts w:cs="Arial"/>
-          <w:sz w:val="18"/>
-          <w:szCs w:val="18"/>
-        </w:rPr>
-        <w:t xml:space="preserve"> eventual tolerância de uma parte para com </w:t>
-      </w:r>
-      <w:proofErr w:type="gramStart"/>
-      <w:r>
-        <w:rPr>
-          <w:rFonts w:cs="Arial"/>
-          <w:sz w:val="18"/>
-          <w:szCs w:val="18"/>
-        </w:rPr>
-        <w:t>a</w:t>
-      </w:r>
-      <w:proofErr w:type="gramEnd"/>
-      <w:r>
-        <w:rPr>
-          <w:rFonts w:cs="Arial"/>
-          <w:sz w:val="18"/>
-          <w:szCs w:val="18"/>
-        </w:rPr>
-        <w:t xml:space="preserve"> outra quanto ao descumprimento de obrigação contratual não implicará novação, perdão, renúncia de direito ou alteração tácita deste contrato.</w:t>
+        <w:t>19.1. A eventual tolerância de uma parte para com a outra quanto ao descumprimento de obrigação contratual não implicará novação, perdão, renúncia de direito ou alteração tácita deste contrato.</w:t>
       </w:r>
     </w:p>
     <w:p>

</xml_diff>